<commit_message>
v20 review fixes: 7 issues fixed (Task #707-#708)
Review of v20 DOCX files found 7 consistency issues, all fixed:

1. Manuscript Introduction: 'orthogonal' -> 'independent information dimension'
   (consistency with Abstract/Results/Cover Letter)
2. Manuscript Methods: TCGA paired comparisons removed Mann-Whitney U test,
   replaced with descriptive statistics justification (consistency with Results)
3. Manuscript Limitations: astrocyte pairs 4,489 -> 5,778 (C(108,2)=5,778)
4. Manuscript Statistical conventions: added 'two-sided' for non-parametric tests
5. Cover Letter: fixed dangling modifier ('we believe CKI aligns' -> 'CKI aligns')
6. Supplementary: astrocyte pairs 4,489 -> 5,778 (same as #3)
7. Repro Guide: 'omega ~ 1' -> 'empirical baseline omega ~ 6.67'
8. Repro Guide: method comparison '4,851 pairs (subset)' -> 'all 5,151 cell-type pairs'

All 8 verification checks passed. v20 ZIP rebuilt (22 files, 2.55 MB).
</commit_message>
<xml_diff>
--- a/version3/CKI_NAR_Submission_v20/CKI_NAR_Manuscript.docx
+++ b/version3/CKI_NAR_Submission_v20/CKI_NAR_Manuscript.docx
@@ -300,7 +300,7 @@
           <w:color w:val="000000"/>
           <w:sz w:val="22"/>
         </w:rPr>
-        <w:t>We validated CKI across four scales, each testing a different aspect of the method. First, we calibrated CKI on Tabula Muris mouse data (5), confirming that random splits of the same cell population yield ω above 1 (empirical calibration baseline 6.67). Second, we extended CKI to Tabula Sapiens human data (6) and found that CKI ω is negatively correlated with all four standard distance metrics, demonstrating that it captures an orthogonal information dimension. Third, we applied CKI to TCGA cancer data (7,8), revealing that tumors are paradoxically more transcriptionally homogeneous than normal tissues. Fourth, we used CKI to analyze a human brain single-nucleus atlas (9), measuring how the same cell types differ across brain regions and demonstrating that CKI can detect persistent developmental signatures—including developmental origin heterogeneity, colonization route boundaries, and a single postnatal migration event—from adult transcriptomic data.</w:t>
+        <w:t>We validated CKI across four scales, each testing a different aspect of the method. First, we calibrated CKI on Tabula Muris mouse data (5), confirming that random splits of the same cell population yield ω above 1 (empirical calibration baseline 6.67). Second, we extended CKI to Tabula Sapiens human data (6) and found that CKI ω is negatively correlated with all four standard distance metrics, demonstrating that it captures an independent information dimension. Third, we applied CKI to TCGA cancer data (7,8), revealing that tumors are paradoxically more transcriptionally homogeneous than normal tissues. Fourth, we used CKI to analyze a human brain single-nucleus atlas (9), measuring how the same cell types differ across brain regions and demonstrating that CKI can detect persistent developmental signatures—including developmental origin heterogeneity, colonization route boundaries, and a single postnatal migration event—from adult transcriptomic data.</w:t>
       </w:r>
     </w:p>
     <w:p>
@@ -596,7 +596,7 @@
           <w:color w:val="000000"/>
           <w:sz w:val="22"/>
         </w:rPr>
-        <w:t>For TCGA clinical severity analysis, we computed intratumoral ω for samples within each clinical stratum using the hybrid scheme (global k_n from shared HK genes, per-pair k_f from top-200 DE genes). BRCA PAM50 subtypes were classified using nearest centroid (Pearson correlation) against the published PAM50 centroids (11,12); 44 of 47 PAM50 genes matched to TCGA gene symbols. LIHC Edmondson histological grades (10) were obtained from cBioPortal (n = 288 tumors with both grade and expression data). LUAD mutation status (EGFR, KRAS, WT) was retrieved from cBioPortal (n = 492 samples). Between-stratum differences were tested with Kruskal-Wallis for PAM50 subtypes and LUAD mutations; trend across Edmondson grades was tested with Jonckheere-Terpstra. Paired vs. unpaired tumor-normal comparisons used Mann-Whitney U test.</w:t>
+        <w:t>For TCGA clinical severity analysis, we computed intratumoral ω for samples within each clinical stratum using the hybrid scheme (global k_n from shared HK genes, per-pair k_f from top-200 DE genes). BRCA PAM50 subtypes were classified using nearest centroid (Pearson correlation) against the published PAM50 centroids (11,12); 44 of 47 PAM50 genes matched to TCGA gene symbols. LIHC Edmondson histological grades (10) were obtained from cBioPortal (n = 288 tumors with both grade and expression data). LUAD mutation status (EGFR, KRAS, WT) was retrieved from cBioPortal (n = 492 samples). Between-stratum differences were tested with Kruskal-Wallis for PAM50 subtypes and LUAD mutations; trend across Edmondson grades was tested with Jonckheere-Terpstra. Paired vs. unpaired tumor-normal comparisons are reported as descriptive statistics (medians and IQRs) without formal P-values, as the paired design (tumor and matched adjacent normal from the same patient) does not meet the independence assumption of standard between-group tests.</w:t>
       </w:r>
     </w:p>
     <w:p>
@@ -2518,7 +2518,7 @@
           <w:color w:val="000000"/>
           <w:sz w:val="22"/>
         </w:rPr>
-        <w:t>Limitations should be noted. First, CKI currently operates at the pseudobulk level; single-cell extensions would need to address sparsity and dropout. Second, the choice of HK gene set influences results; CKI uses the HRT Atlas v1.0 reference (4) as the HK gene source for all reported analyses. The CKI package also supports data-driven auto-detection (combined detection-rate and CV filtering, use_reference = False) as the universal default, but this was not used in the reported analyses. Sensitivity analysis showed that CKI results are robust to alternative HK definitions (using the lowest 10% variable genes as a neutral set yielded ω correlations r &gt; 0.95). Third, the use of highly variable genes (HVGs) for k_f introduces systematic inflation: the calibration controls (random split of the same population) yielded a mean ω = 6.67, demonstrating that k_f systematically exceeds k_n even for identical populations. This inflation is a direct consequence of pre-selecting genes with high cross-cell variance. The permutation test accounts for this by comparing observed ω against a null distribution constructed under the same gene selection procedure with randomly permuted labels. Fourth, TCGA analysis was limited to bulk RNA-seq resolution; the per-cancer bootstrap (B = 1,000) permutes sample labels (tumor vs. normal) to construct the null distribution. With 5 cancer types, TCGA results should be interpreted as exploratory. Fifth, the brain analysis uses post-mortem tissue; developmental time courses would provide stronger evidence for migration inference. Sixth, the brain regional analysis generated 31,764 cross-region comparisons. Benjamini-Hochberg FDR correction was applied to the per-cell-class bootstrap results. The 30 Strong candidates from the multiplicative residual model represent the most extreme deviations from the expected log-linear relationship between regional divergence and physical distance; they should be interpreted as hypothesis-generating signals requiring independent validation. The systematic concordance with known developmental biology provides post hoc biological plausibility, but formal FDR-controlled discovery would require larger cohorts and pre-registered hypotheses. Seventh, the ω distribution is right-skewed and non-normal across all datasets (brain skewness = 2.22, excess kurtosis = 7.28; Shapiro-Wilk and D’Agostino-Pearson tests reject normality at P &lt; 0.001). Consequently, Cohen’s d is reported as a descriptive measure of effect size rather than a parametric test statistic. Eighth, permutation testing of the residual model (B = 10,000 per-signal empirical P-values, Benjamini-Hochberg FDR across all 31,764 pairs) revealed that 14 of 30 Strong threshold-passing signals—comprising all 10 microglia, 1 fibroblast, and 3 vascular signals—did not reach statistical significance (all P ≥ 0.76, q = 1.0). These signals should be interpreted with caution as they may reflect stochastic variation rather than robust biological patterns. Ninth, bootstrap 95% confidence intervals (B = 10,000, pair-level resampling) were computed for all key ω estimates; confidence interval widths scale inversely with the number of contributing pairs, such that cell types with fewer regional comparisons (e.g., Bergmann glia, 21 pairs) yield wider intervals than well-sampled types (e.g., astrocytes, 4,489 pairs). Tenth, the empirical calibration baseline (ω = 6.67) is derived from only n = 6 split-half controls in a single species (mouse); while calibrated omega (ω_cal = ω / 6.67) restores the interpretability of the ratio framework, the baseline may vary across tissues, species, and sequencing platforms, and a larger multi-dataset calibration study would strengthen the generality of this constant. Eleventh, k_n and k_f are computed on gene sets of different sizes (~1,130 HK genes vs. 200–2,000 HVG genes); while simulation confirmed that JS divergence between random distributions is dimensionally invariant (ratio = 1.001 between d = 1,130 and d = 2,000; Supplementary Fig. S10), the systematic inflation of k_f arises from HVG selection bias rather than dimensionality, and the calibrated omega absorbs this bias. Twelfth, the hybrid scheme used for human and TCGA analyses computes k_n globally (constant across all pairs), which reduces ω to a scaled k_f ranking; per-pair k_n analysis in the brain data (CV = 97.35%) showed that pair-specific k_n varies substantially and yields substantially different ω rankings (Spearman ρ = −0.027 vs. global-kn ω), confirming that the per-pair approach used for brain analysis is more informative but also more computationally expensive. Thirteenth, BH-FDR correction is applied separately within each dataset (mouse, human, TCGA, brain), which means that significance thresholds are not directly comparable across datasets; cross-dataset meta-analysis would require a unified multiple-testing framework. Fourteenth, CKI has not been validated on synthetic data with known ground-truth selection signals; while the calibration controls and OPC negative control provide internal consistency checks, a simulation benchmark with injected functional divergence of known magnitude would provide stronger evidence for the method’s sensitivity and specificity. Fifteenth, key parameters (softmax temperature, pseudocount ε = 1e-9, top-200 DE genes for k_f, HVG count of 2,000, log-base 2 for JS divergence) were chosen based on practical considerations rather than formal optimization; while sensitivity analyses showed robustness to parameter variation, a systematic parameter sweep across all parameters simultaneously was not performed.</w:t>
+        <w:t>Limitations should be noted. First, CKI currently operates at the pseudobulk level; single-cell extensions would need to address sparsity and dropout. Second, the choice of HK gene set influences results; CKI uses the HRT Atlas v1.0 reference (4) as the HK gene source for all reported analyses. The CKI package also supports data-driven auto-detection (combined detection-rate and CV filtering, use_reference = False) as the universal default, but this was not used in the reported analyses. Sensitivity analysis showed that CKI results are robust to alternative HK definitions (using the lowest 10% variable genes as a neutral set yielded ω correlations r &gt; 0.95). Third, the use of highly variable genes (HVGs) for k_f introduces systematic inflation: the calibration controls (random split of the same population) yielded a mean ω = 6.67, demonstrating that k_f systematically exceeds k_n even for identical populations. This inflation is a direct consequence of pre-selecting genes with high cross-cell variance. The permutation test accounts for this by comparing observed ω against a null distribution constructed under the same gene selection procedure with randomly permuted labels. Fourth, TCGA analysis was limited to bulk RNA-seq resolution; the per-cancer bootstrap (B = 1,000) permutes sample labels (tumor vs. normal) to construct the null distribution. With 5 cancer types, TCGA results should be interpreted as exploratory. Fifth, the brain analysis uses post-mortem tissue; developmental time courses would provide stronger evidence for migration inference. Sixth, the brain regional analysis generated 31,764 cross-region comparisons. Benjamini-Hochberg FDR correction was applied to the per-cell-class bootstrap results. The 30 Strong candidates from the multiplicative residual model represent the most extreme deviations from the expected log-linear relationship between regional divergence and physical distance; they should be interpreted as hypothesis-generating signals requiring independent validation. The systematic concordance with known developmental biology provides post hoc biological plausibility, but formal FDR-controlled discovery would require larger cohorts and pre-registered hypotheses. Seventh, the ω distribution is right-skewed and non-normal across all datasets (brain skewness = 2.22, excess kurtosis = 7.28; Shapiro-Wilk and D’Agostino-Pearson tests reject normality at P &lt; 0.001). Consequently, Cohen’s d is reported as a descriptive measure of effect size rather than a parametric test statistic. Eighth, permutation testing of the residual model (B = 10,000 per-signal empirical P-values, Benjamini-Hochberg FDR across all 31,764 pairs) revealed that 14 of 30 Strong threshold-passing signals—comprising all 10 microglia, 1 fibroblast, and 3 vascular signals—did not reach statistical significance (all P ≥ 0.76, q = 1.0). These signals should be interpreted with caution as they may reflect stochastic variation rather than robust biological patterns. Ninth, bootstrap 95% confidence intervals (B = 10,000, pair-level resampling) were computed for all key ω estimates; confidence interval widths scale inversely with the number of contributing pairs, such that cell types with fewer regional comparisons (e.g., Bergmann glia, 21 pairs) yield wider intervals than well-sampled types (e.g., astrocytes, 5,778 pairs). Tenth, the empirical calibration baseline (ω = 6.67) is derived from only n = 6 split-half controls in a single species (mouse); while calibrated omega (ω_cal = ω / 6.67) restores the interpretability of the ratio framework, the baseline may vary across tissues, species, and sequencing platforms, and a larger multi-dataset calibration study would strengthen the generality of this constant. Eleventh, k_n and k_f are computed on gene sets of different sizes (~1,130 HK genes vs. 200–2,000 HVG genes); while simulation confirmed that JS divergence between random distributions is dimensionally invariant (ratio = 1.001 between d = 1,130 and d = 2,000; Supplementary Fig. S10), the systematic inflation of k_f arises from HVG selection bias rather than dimensionality, and the calibrated omega absorbs this bias. Twelfth, the hybrid scheme used for human and TCGA analyses computes k_n globally (constant across all pairs), which reduces ω to a scaled k_f ranking; per-pair k_n analysis in the brain data (CV = 97.35%) showed that pair-specific k_n varies substantially and yields substantially different ω rankings (Spearman ρ = −0.027 vs. global-kn ω), confirming that the per-pair approach used for brain analysis is more informative but also more computationally expensive. Thirteenth, BH-FDR correction is applied separately within each dataset (mouse, human, TCGA, brain), which means that significance thresholds are not directly comparable across datasets; cross-dataset meta-analysis would require a unified multiple-testing framework. Fourteenth, CKI has not been validated on synthetic data with known ground-truth selection signals; while the calibration controls and OPC negative control provide internal consistency checks, a simulation benchmark with injected functional divergence of known magnitude would provide stronger evidence for the method’s sensitivity and specificity. Fifteenth, key parameters (softmax temperature, pseudocount ε = 1e-9, top-200 DE genes for k_f, HVG count of 2,000, log-base 2 for JS divergence) were chosen based on practical considerations rather than formal optimization; while sensitivity analyses showed robustness to parameter variation, a systematic parameter sweep across all parameters simultaneously was not performed.</w:t>
       </w:r>
     </w:p>
     <w:p>
@@ -3054,7 +3054,7 @@
           <w:color w:val="000000"/>
           <w:sz w:val="22"/>
         </w:rPr>
-        <w:t>Statistical conventions. All P-values are from one-sided permutation tests (B = 1,000 for mouse/human/TCGA/brain; B = 10,000 for the multiplicative residual model) unless otherwise specified. Benjamini-Hochberg FDR correction was applied within each dataset. Non-parametric tests (Spearman correlation, Mann-Whitney U, Kruskal-Wallis, Jonckheere-Terpstra) are reported with exact P-values; descriptive statistics are reported as mean ± SD or median [IQR] as indicated. Effect sizes include standardized effect size (SES = (ω_obs − mean(ω_null)) / sd(ω_null)) and Cohen's d (reported as descriptive due to ω non-normality). Bootstrap 95% confidence intervals use B = 10,000 resamples. All analyses use JS divergence with base-2 logarithm. Sample sizes (n) are reported for each comparison.</w:t>
+        <w:t>Statistical conventions. All P-values are from one-sided permutation tests (B = 1,000 for mouse/human/TCGA/brain; B = 10,000 for the multiplicative residual model) unless otherwise specified. Benjamini-Hochberg FDR correction was applied within each dataset. Non-parametric tests (Spearman correlation, Mann-Whitney U, Kruskal-Wallis, Jonckheere-Terpstra) are two-sided and reported with exact P-values; descriptive statistics are reported as mean ± SD or median [IQR] as indicated. Effect sizes include standardized effect size (SES = (ω_obs − mean(ω_null)) / sd(ω_null)) and Cohen's d (reported as descriptive due to ω non-normality). Bootstrap 95% confidence intervals use B = 10,000 resamples. All analyses use JS divergence with base-2 logarithm. Sample sizes (n) are reported for each comparison.</w:t>
       </w:r>
     </w:p>
     <w:p>

</xml_diff>